<commit_message>
Add Data Analysis Assignment Report with detailed sections on project and data description, preparation steps, individual analyses, group hypothesis, and conclusions.
</commit_message>
<xml_diff>
--- a/docs/reports/Data Analysis Assignment Report.docx
+++ b/docs/reports/Data Analysis Assignment Report.docx
@@ -2718,15 +2718,7 @@
         <w:pStyle w:val="Heading3"/>
       </w:pPr>
       <w:r>
-        <w:t xml:space="preserve">no </w:t>
-      </w:r>
-      <w:proofErr w:type="gramStart"/>
-      <w:r>
-        <w:t>remove</w:t>
-      </w:r>
-      <w:proofErr w:type="gramEnd"/>
-      <w:r>
-        <w:t xml:space="preserve"> duplicate</w:t>
+        <w:t>no remove duplicate</w:t>
       </w:r>
     </w:p>
     <w:p>
@@ -2827,19 +2819,9 @@
       <w:pPr>
         <w:pStyle w:val="Heading3"/>
       </w:pPr>
-      <w:proofErr w:type="gramStart"/>
-      <w:r>
-        <w:t>no</w:t>
-      </w:r>
-      <w:proofErr w:type="gramEnd"/>
-      <w:r>
-        <w:t xml:space="preserve"> </w:t>
-      </w:r>
-      <w:proofErr w:type="gramStart"/>
-      <w:r>
-        <w:t>pay ransom</w:t>
-      </w:r>
-      <w:proofErr w:type="gramEnd"/>
+      <w:r>
+        <w:t>no pay ransom</w:t>
+      </w:r>
     </w:p>
     <w:p>
       <w:pPr>
@@ -3234,27 +3216,7 @@
           <w:b w:val="0"/>
           <w:bCs w:val="0"/>
         </w:rPr>
-        <w:t xml:space="preserve">To identify the </w:t>
-      </w:r>
-      <w:proofErr w:type="gramStart"/>
-      <w:r>
-        <w:rPr>
-          <w:rStyle w:val="Strong"/>
-          <w:rFonts w:eastAsiaTheme="majorEastAsia"/>
-          <w:b w:val="0"/>
-          <w:bCs w:val="0"/>
-        </w:rPr>
-        <w:t>most commonly targeted</w:t>
-      </w:r>
-      <w:proofErr w:type="gramEnd"/>
-      <w:r>
-        <w:rPr>
-          <w:rStyle w:val="Strong"/>
-          <w:rFonts w:eastAsiaTheme="majorEastAsia"/>
-          <w:b w:val="0"/>
-          <w:bCs w:val="0"/>
-        </w:rPr>
-        <w:t xml:space="preserve"> countries, attacker profiles, IP ranges, and encodings </w:t>
+        <w:t xml:space="preserve">To identify the most commonly targeted countries, attacker profiles, IP ranges, and encodings </w:t>
       </w:r>
       <w:r>
         <w:rPr>
@@ -8494,6 +8456,7 @@
   <w:style w:type="character" w:default="1" w:styleId="DefaultParagraphFont">
     <w:name w:val="Default Paragraph Font"/>
     <w:uiPriority w:val="1"/>
+    <w:semiHidden/>
     <w:unhideWhenUsed/>
   </w:style>
   <w:style w:type="table" w:default="1" w:styleId="TableNormal">
@@ -9158,14 +9121,12 @@
 </file>
 
 <file path=customXml/item1.xml><?xml version="1.0" encoding="utf-8"?>
-<p:properties xmlns:p="http://schemas.microsoft.com/office/2006/metadata/properties" xmlns:xsi="http://www.w3.org/2001/XMLSchema-instance" xmlns:pc="http://schemas.microsoft.com/office/infopath/2007/PartnerControls">
-  <documentManagement>
-    <lcf76f155ced4ddcb4097134ff3c332f xmlns="24cc9abb-d599-4b39-b4dc-2e99b451617c">
-      <Terms xmlns="http://schemas.microsoft.com/office/infopath/2007/PartnerControls"/>
-    </lcf76f155ced4ddcb4097134ff3c332f>
-    <TaxCatchAll xmlns="8d8fe997-2e2b-465f-a09c-1e6ab0e55925" xsi:nil="true"/>
-  </documentManagement>
-</p:properties>
+<?mso-contentType ?>
+<FormTemplates xmlns="http://schemas.microsoft.com/sharepoint/v3/contenttype/forms">
+  <Display>DocumentLibraryForm</Display>
+  <Edit>DocumentLibraryForm</Edit>
+  <New>DocumentLibraryForm</New>
+</FormTemplates>
 </file>
 
 <file path=customXml/item2.xml><?xml version="1.0" encoding="utf-8"?>
@@ -9364,12 +9325,14 @@
 </file>
 
 <file path=customXml/item3.xml><?xml version="1.0" encoding="utf-8"?>
-<?mso-contentType ?>
-<FormTemplates xmlns="http://schemas.microsoft.com/sharepoint/v3/contenttype/forms">
-  <Display>DocumentLibraryForm</Display>
-  <Edit>DocumentLibraryForm</Edit>
-  <New>DocumentLibraryForm</New>
-</FormTemplates>
+<p:properties xmlns:p="http://schemas.microsoft.com/office/2006/metadata/properties" xmlns:xsi="http://www.w3.org/2001/XMLSchema-instance" xmlns:pc="http://schemas.microsoft.com/office/infopath/2007/PartnerControls">
+  <documentManagement>
+    <lcf76f155ced4ddcb4097134ff3c332f xmlns="24cc9abb-d599-4b39-b4dc-2e99b451617c">
+      <Terms xmlns="http://schemas.microsoft.com/office/infopath/2007/PartnerControls"/>
+    </lcf76f155ced4ddcb4097134ff3c332f>
+    <TaxCatchAll xmlns="8d8fe997-2e2b-465f-a09c-1e6ab0e55925" xsi:nil="true"/>
+  </documentManagement>
+</p:properties>
 </file>
 
 <file path=customXml/item4.xml><?xml version="1.0" encoding="utf-8"?>
@@ -9377,12 +9340,9 @@
 </file>
 
 <file path=customXml/itemProps1.xml><?xml version="1.0" encoding="utf-8"?>
-<ds:datastoreItem xmlns:ds="http://schemas.openxmlformats.org/officeDocument/2006/customXml" ds:itemID="{2D9E404E-E7CB-4A0D-A8FF-85E6F215042B}">
+<ds:datastoreItem xmlns:ds="http://schemas.openxmlformats.org/officeDocument/2006/customXml" ds:itemID="{731EDFEA-EDBB-470F-A60F-FA2FEE3C8E7F}">
   <ds:schemaRefs>
-    <ds:schemaRef ds:uri="http://schemas.microsoft.com/office/2006/metadata/properties"/>
-    <ds:schemaRef ds:uri="http://schemas.microsoft.com/office/infopath/2007/PartnerControls"/>
-    <ds:schemaRef ds:uri="24cc9abb-d599-4b39-b4dc-2e99b451617c"/>
-    <ds:schemaRef ds:uri="8d8fe997-2e2b-465f-a09c-1e6ab0e55925"/>
+    <ds:schemaRef ds:uri="http://schemas.microsoft.com/sharepoint/v3/contenttype/forms"/>
   </ds:schemaRefs>
 </ds:datastoreItem>
 </file>
@@ -9407,9 +9367,12 @@
 </file>
 
 <file path=customXml/itemProps3.xml><?xml version="1.0" encoding="utf-8"?>
-<ds:datastoreItem xmlns:ds="http://schemas.openxmlformats.org/officeDocument/2006/customXml" ds:itemID="{731EDFEA-EDBB-470F-A60F-FA2FEE3C8E7F}">
+<ds:datastoreItem xmlns:ds="http://schemas.openxmlformats.org/officeDocument/2006/customXml" ds:itemID="{2D9E404E-E7CB-4A0D-A8FF-85E6F215042B}">
   <ds:schemaRefs>
-    <ds:schemaRef ds:uri="http://schemas.microsoft.com/sharepoint/v3/contenttype/forms"/>
+    <ds:schemaRef ds:uri="http://schemas.microsoft.com/office/2006/metadata/properties"/>
+    <ds:schemaRef ds:uri="http://schemas.microsoft.com/office/infopath/2007/PartnerControls"/>
+    <ds:schemaRef ds:uri="24cc9abb-d599-4b39-b4dc-2e99b451617c"/>
+    <ds:schemaRef ds:uri="8d8fe997-2e2b-465f-a09c-1e6ab0e55925"/>
   </ds:schemaRefs>
 </ds:datastoreItem>
 </file>

</xml_diff>